<commit_message>
Final update to project report
</commit_message>
<xml_diff>
--- a/Project_Report.docx
+++ b/Project_Report.docx
@@ -62,7 +62,47 @@
           <w:sz w:val="24"/>
           <w:szCs w:val="24"/>
         </w:rPr>
-        <w:t>Student Name- Aarushi Srivastava</w:t>
+        <w:t>Student Name</w:t>
+      </w:r>
+      <w:r>
+        <w:rPr>
+          <w:rFonts w:ascii="Times New Roman" w:hAnsi="Times New Roman" w:cs="Times New Roman"/>
+          <w:b/>
+          <w:bCs/>
+          <w:sz w:val="24"/>
+          <w:szCs w:val="24"/>
+        </w:rPr>
+        <w:t xml:space="preserve"> </w:t>
+      </w:r>
+      <w:r>
+        <w:rPr>
+          <w:rFonts w:ascii="Times New Roman" w:hAnsi="Times New Roman" w:cs="Times New Roman"/>
+          <w:b/>
+          <w:bCs/>
+          <w:sz w:val="24"/>
+          <w:szCs w:val="24"/>
+        </w:rPr>
+        <w:t xml:space="preserve">- </w:t>
+      </w:r>
+      <w:r>
+        <w:rPr>
+          <w:rFonts w:ascii="Times New Roman" w:hAnsi="Times New Roman" w:cs="Times New Roman"/>
+          <w:b/>
+          <w:bCs/>
+          <w:sz w:val="24"/>
+          <w:szCs w:val="24"/>
+        </w:rPr>
+        <w:t xml:space="preserve"> </w:t>
+      </w:r>
+      <w:r>
+        <w:rPr>
+          <w:rFonts w:ascii="Times New Roman" w:hAnsi="Times New Roman" w:cs="Times New Roman"/>
+          <w:b/>
+          <w:bCs/>
+          <w:sz w:val="24"/>
+          <w:szCs w:val="24"/>
+        </w:rPr>
+        <w:t>Aarushi Srivastava</w:t>
       </w:r>
       <w:r>
         <w:rPr>
@@ -73,38 +113,68 @@
           <w:szCs w:val="24"/>
         </w:rPr>
         <w:br/>
-        <w:t>Reg No.           -</w:t>
-      </w:r>
-    </w:p>
-    <w:p>
-      <w:pPr>
-        <w:rPr>
-          <w:rFonts w:ascii="Times New Roman" w:hAnsi="Times New Roman" w:cs="Times New Roman"/>
-          <w:b/>
-          <w:bCs/>
-          <w:sz w:val="24"/>
-          <w:szCs w:val="24"/>
-        </w:rPr>
-      </w:pPr>
-      <w:r>
-        <w:rPr>
-          <w:rFonts w:ascii="Times New Roman" w:hAnsi="Times New Roman" w:cs="Times New Roman"/>
-          <w:b/>
-          <w:bCs/>
-          <w:sz w:val="24"/>
-          <w:szCs w:val="24"/>
-        </w:rPr>
-        <w:t>Branch</w:t>
-      </w:r>
-      <w:r>
-        <w:rPr>
-          <w:rFonts w:ascii="Times New Roman" w:hAnsi="Times New Roman" w:cs="Times New Roman"/>
-          <w:b/>
-          <w:bCs/>
-          <w:sz w:val="24"/>
-          <w:szCs w:val="24"/>
-        </w:rPr>
-        <w:t xml:space="preserve"> –</w:t>
+        <w:t xml:space="preserve">Reg No. </w:t>
+      </w:r>
+      <w:r>
+        <w:rPr>
+          <w:rFonts w:ascii="Times New Roman" w:hAnsi="Times New Roman" w:cs="Times New Roman"/>
+          <w:b/>
+          <w:bCs/>
+          <w:sz w:val="24"/>
+          <w:szCs w:val="24"/>
+        </w:rPr>
+        <w:t xml:space="preserve">           </w:t>
+      </w:r>
+      <w:r>
+        <w:rPr>
+          <w:rFonts w:ascii="Times New Roman" w:hAnsi="Times New Roman" w:cs="Times New Roman"/>
+          <w:b/>
+          <w:bCs/>
+          <w:sz w:val="24"/>
+          <w:szCs w:val="24"/>
+        </w:rPr>
+        <w:t>-</w:t>
+      </w:r>
+      <w:r>
+        <w:rPr>
+          <w:rFonts w:ascii="Times New Roman" w:hAnsi="Times New Roman" w:cs="Times New Roman"/>
+          <w:b/>
+          <w:bCs/>
+          <w:sz w:val="24"/>
+          <w:szCs w:val="24"/>
+        </w:rPr>
+        <w:t xml:space="preserve">  25BAI10536</w:t>
+      </w:r>
+    </w:p>
+    <w:p>
+      <w:pPr>
+        <w:rPr>
+          <w:rFonts w:ascii="Times New Roman" w:hAnsi="Times New Roman" w:cs="Times New Roman"/>
+          <w:b/>
+          <w:bCs/>
+          <w:sz w:val="24"/>
+          <w:szCs w:val="24"/>
+        </w:rPr>
+      </w:pPr>
+      <w:r>
+        <w:rPr>
+          <w:rFonts w:ascii="Times New Roman" w:hAnsi="Times New Roman" w:cs="Times New Roman"/>
+          <w:b/>
+          <w:bCs/>
+          <w:sz w:val="24"/>
+          <w:szCs w:val="24"/>
+        </w:rPr>
+        <w:t xml:space="preserve">Branch </w:t>
+      </w:r>
+      <w:r>
+        <w:rPr>
+          <w:rFonts w:ascii="Times New Roman" w:hAnsi="Times New Roman" w:cs="Times New Roman"/>
+          <w:b/>
+          <w:bCs/>
+          <w:sz w:val="24"/>
+          <w:szCs w:val="24"/>
+        </w:rPr>
+        <w:t xml:space="preserve">           -</w:t>
       </w:r>
       <w:r>
         <w:rPr>
@@ -119,6 +189,16 @@
       <w:r>
         <w:rPr>
           <w:rFonts w:ascii="Times New Roman" w:hAnsi="Times New Roman" w:cs="Times New Roman"/>
+          <w:b/>
+          <w:bCs/>
+          <w:sz w:val="24"/>
+          <w:szCs w:val="24"/>
+        </w:rPr>
+        <w:t xml:space="preserve">  </w:t>
+      </w:r>
+      <w:r>
+        <w:rPr>
+          <w:rFonts w:ascii="Times New Roman" w:hAnsi="Times New Roman" w:cs="Times New Roman"/>
           <w:sz w:val="24"/>
           <w:szCs w:val="24"/>
         </w:rPr>
@@ -151,7 +231,7 @@
           <w:sz w:val="24"/>
           <w:szCs w:val="24"/>
         </w:rPr>
-        <w:t>__</w:t>
+        <w:t xml:space="preserve">             -   </w:t>
       </w:r>
       <w:r>
         <w:rPr>
@@ -180,7 +260,37 @@
           <w:sz w:val="24"/>
           <w:szCs w:val="24"/>
         </w:rPr>
-        <w:t>Course Code-</w:t>
+        <w:t>Course Code</w:t>
+      </w:r>
+      <w:r>
+        <w:rPr>
+          <w:rFonts w:ascii="Times New Roman" w:hAnsi="Times New Roman" w:cs="Times New Roman"/>
+          <w:b/>
+          <w:bCs/>
+          <w:sz w:val="24"/>
+          <w:szCs w:val="24"/>
+        </w:rPr>
+        <w:t xml:space="preserve">   </w:t>
+      </w:r>
+      <w:r>
+        <w:rPr>
+          <w:rFonts w:ascii="Times New Roman" w:hAnsi="Times New Roman" w:cs="Times New Roman"/>
+          <w:b/>
+          <w:bCs/>
+          <w:sz w:val="24"/>
+          <w:szCs w:val="24"/>
+        </w:rPr>
+        <w:t>-</w:t>
+      </w:r>
+      <w:r>
+        <w:rPr>
+          <w:rFonts w:ascii="Times New Roman" w:hAnsi="Times New Roman" w:cs="Times New Roman"/>
+          <w:b/>
+          <w:bCs/>
+          <w:sz w:val="24"/>
+          <w:szCs w:val="24"/>
+        </w:rPr>
+        <w:t xml:space="preserve">   CSE0001</w:t>
       </w:r>
     </w:p>
     <w:p>
@@ -401,15 +511,7 @@
           <w:sz w:val="24"/>
           <w:szCs w:val="24"/>
         </w:rPr>
-        <w:t>-</w:t>
-      </w:r>
-      <w:r>
-        <w:rPr>
-          <w:rFonts w:ascii="Times New Roman" w:hAnsi="Times New Roman" w:cs="Times New Roman"/>
-          <w:sz w:val="24"/>
-          <w:szCs w:val="24"/>
-        </w:rPr>
-        <w:t xml:space="preserve"> </w:t>
+        <w:t xml:space="preserve">- </w:t>
       </w:r>
       <w:r>
         <w:rPr>
@@ -572,17 +674,7 @@
           <w:sz w:val="24"/>
           <w:szCs w:val="24"/>
         </w:rPr>
-        <w:t xml:space="preserve"> </w:t>
-      </w:r>
-      <w:r>
-        <w:rPr>
-          <w:rFonts w:ascii="Times New Roman" w:hAnsi="Times New Roman" w:cs="Times New Roman"/>
-          <w:b/>
-          <w:bCs/>
-          <w:sz w:val="24"/>
-          <w:szCs w:val="24"/>
-        </w:rPr>
-        <w:t>Build Your Student Digital Portfolio</w:t>
+        <w:t xml:space="preserve"> Build Your Student Digital Portfolio</w:t>
       </w:r>
     </w:p>
     <w:p>
@@ -837,21 +929,22 @@
           <w:lang w:eastAsia="en-IN" w:bidi="sa-IN"/>
           <w14:ligatures w14:val="none"/>
         </w:rPr>
-        <w:t xml:space="preserve"> T</w:t>
-      </w:r>
-      <w:r>
-        <w:rPr>
-          <w:rFonts w:eastAsia="Times New Roman"/>
+        <w:t xml:space="preserve"> This task focused on real-life communication scenarios commonly faced by students in academic and professional settings. I wrote two formal emails—one to a professor requesting an assignment deadline extension and another to an internship coordinator expressing interest in a summer internship. Both emails followed proper structure, clarity, and professionalism, similar to communication standards used in platforms like Gmail.</w:t>
+      </w:r>
+    </w:p>
+    <w:p>
+      <w:pPr>
+        <w:spacing w:before="100" w:beforeAutospacing="1" w:after="100" w:afterAutospacing="1" w:line="240" w:lineRule="auto"/>
+        <w:rPr>
+          <w:rFonts w:ascii="Times New Roman" w:eastAsia="Times New Roman" w:hAnsi="Times New Roman" w:cs="Times New Roman"/>
           <w:kern w:val="0"/>
+          <w:sz w:val="24"/>
+          <w:szCs w:val="24"/>
           <w:lang w:eastAsia="en-IN" w:bidi="sa-IN"/>
           <w14:ligatures w14:val="none"/>
         </w:rPr>
-        <w:t>his task focused on real-life communication scenarios commonly faced by students in academic and professional settings. I wrote two formal emails—one to a professor requesting an assignment deadline extension and another to an internship coordinator expressing interest in a summer internship. Both emails followed proper structure, clarity, and professionalism, similar to communication standards used in platforms like Gmail.</w:t>
-      </w:r>
-    </w:p>
-    <w:p>
-      <w:pPr>
-        <w:spacing w:before="100" w:beforeAutospacing="1" w:after="100" w:afterAutospacing="1" w:line="240" w:lineRule="auto"/>
+      </w:pPr>
+      <w:r>
         <w:rPr>
           <w:rFonts w:ascii="Times New Roman" w:eastAsia="Times New Roman" w:hAnsi="Times New Roman" w:cs="Times New Roman"/>
           <w:kern w:val="0"/>
@@ -860,7 +953,8 @@
           <w:lang w:eastAsia="en-IN" w:bidi="sa-IN"/>
           <w14:ligatures w14:val="none"/>
         </w:rPr>
-      </w:pPr>
+        <w:t xml:space="preserve">Additionally, I created a Social Media Do’s and Don’ts checklist to promote responsible online </w:t>
+      </w:r>
       <w:r>
         <w:rPr>
           <w:rFonts w:ascii="Times New Roman" w:eastAsia="Times New Roman" w:hAnsi="Times New Roman" w:cs="Times New Roman"/>
@@ -870,7 +964,7 @@
           <w:lang w:eastAsia="en-IN" w:bidi="sa-IN"/>
           <w14:ligatures w14:val="none"/>
         </w:rPr>
-        <w:t xml:space="preserve">Additionally, I created a Social Media Do’s and Don’ts checklist to promote responsible online </w:t>
+        <w:t>behaviour</w:t>
       </w:r>
       <w:r>
         <w:rPr>
@@ -881,8 +975,18 @@
           <w:lang w:eastAsia="en-IN" w:bidi="sa-IN"/>
           <w14:ligatures w14:val="none"/>
         </w:rPr>
-        <w:t>behaviour</w:t>
-      </w:r>
+        <w:t>, including maintaining privacy, avoiding inappropriate content, and communicating respectfully.</w:t>
+      </w:r>
+    </w:p>
+    <w:p>
+      <w:pPr>
+        <w:spacing w:before="100" w:beforeAutospacing="1" w:after="100" w:afterAutospacing="1" w:line="240" w:lineRule="auto"/>
+        <w:rPr>
+          <w:rFonts w:ascii="Times New Roman" w:hAnsi="Times New Roman" w:cs="Times New Roman"/>
+          <w:sz w:val="24"/>
+          <w:szCs w:val="24"/>
+        </w:rPr>
+      </w:pPr>
       <w:r>
         <w:rPr>
           <w:rFonts w:ascii="Times New Roman" w:eastAsia="Times New Roman" w:hAnsi="Times New Roman" w:cs="Times New Roman"/>
@@ -892,18 +996,8 @@
           <w:lang w:eastAsia="en-IN" w:bidi="sa-IN"/>
           <w14:ligatures w14:val="none"/>
         </w:rPr>
-        <w:t>, including maintaining privacy, avoiding inappropriate content, and communicating respectfully.</w:t>
-      </w:r>
-    </w:p>
-    <w:p>
-      <w:pPr>
-        <w:spacing w:before="100" w:beforeAutospacing="1" w:after="100" w:afterAutospacing="1" w:line="240" w:lineRule="auto"/>
-        <w:rPr>
-          <w:rFonts w:ascii="Times New Roman" w:hAnsi="Times New Roman" w:cs="Times New Roman"/>
-          <w:sz w:val="24"/>
-          <w:szCs w:val="24"/>
-        </w:rPr>
-      </w:pPr>
+        <w:t xml:space="preserve">Through this task, I learned the importance of clear, polite, and concise communication. It also helped me understand how digital </w:t>
+      </w:r>
       <w:r>
         <w:rPr>
           <w:rFonts w:ascii="Times New Roman" w:eastAsia="Times New Roman" w:hAnsi="Times New Roman" w:cs="Times New Roman"/>
@@ -913,7 +1007,7 @@
           <w:lang w:eastAsia="en-IN" w:bidi="sa-IN"/>
           <w14:ligatures w14:val="none"/>
         </w:rPr>
-        <w:t xml:space="preserve">Through this task, I learned the importance of clear, polite, and concise communication. It also helped me understand how digital </w:t>
+        <w:t>behaviour</w:t>
       </w:r>
       <w:r>
         <w:rPr>
@@ -924,9 +1018,20 @@
           <w:lang w:eastAsia="en-IN" w:bidi="sa-IN"/>
           <w14:ligatures w14:val="none"/>
         </w:rPr>
-        <w:t>behaviour</w:t>
-      </w:r>
-      <w:r>
+        <w:t xml:space="preserve"> impacts personal and professional reputation. These skills will be valuable for future academic interactions, job applications, and maintaining a positive digital presence.</w:t>
+      </w:r>
+      <w:r>
+        <w:rPr>
+          <w:rFonts w:ascii="Times New Roman" w:hAnsi="Times New Roman" w:cs="Times New Roman"/>
+          <w:sz w:val="24"/>
+          <w:szCs w:val="24"/>
+        </w:rPr>
+        <w:t xml:space="preserve"> </w:t>
+      </w:r>
+    </w:p>
+    <w:p>
+      <w:pPr>
+        <w:spacing w:before="100" w:beforeAutospacing="1" w:after="100" w:afterAutospacing="1" w:line="240" w:lineRule="auto"/>
         <w:rPr>
           <w:rFonts w:ascii="Times New Roman" w:eastAsia="Times New Roman" w:hAnsi="Times New Roman" w:cs="Times New Roman"/>
           <w:kern w:val="0"/>
@@ -935,20 +1040,228 @@
           <w:lang w:eastAsia="en-IN" w:bidi="sa-IN"/>
           <w14:ligatures w14:val="none"/>
         </w:rPr>
-        <w:t xml:space="preserve"> impacts personal and professional reputation. These skills will be valuable for future academic interactions, job applications, and maintaining a positive digital presence.</w:t>
-      </w:r>
-      <w:r>
-        <w:rPr>
-          <w:rFonts w:ascii="Times New Roman" w:hAnsi="Times New Roman" w:cs="Times New Roman"/>
-          <w:sz w:val="24"/>
-          <w:szCs w:val="24"/>
+      </w:pPr>
+      <w:r>
+        <w:rPr>
+          <w:rFonts w:ascii="Times New Roman" w:hAnsi="Times New Roman" w:cs="Times New Roman"/>
+          <w:sz w:val="24"/>
+          <w:szCs w:val="24"/>
+        </w:rPr>
+        <w:t>The purpose of this task was to enhance my formal communication skills and digital responsibility</w:t>
+      </w:r>
+    </w:p>
+    <w:p>
+      <w:pPr>
+        <w:spacing w:after="0"/>
+        <w:jc w:val="both"/>
+        <w:rPr>
+          <w:rFonts w:ascii="Times New Roman" w:hAnsi="Times New Roman" w:cs="Times New Roman"/>
+          <w:b/>
+          <w:bCs/>
+          <w:sz w:val="24"/>
+          <w:szCs w:val="24"/>
+        </w:rPr>
+      </w:pPr>
+    </w:p>
+    <w:p>
+      <w:pPr>
+        <w:spacing w:after="0"/>
+        <w:jc w:val="both"/>
+        <w:rPr>
+          <w:rFonts w:ascii="Times New Roman" w:hAnsi="Times New Roman" w:cs="Times New Roman"/>
+          <w:b/>
+          <w:bCs/>
+          <w:sz w:val="24"/>
+          <w:szCs w:val="24"/>
+        </w:rPr>
+      </w:pPr>
+      <w:r>
+        <w:rPr>
+          <w:rFonts w:ascii="Times New Roman" w:hAnsi="Times New Roman" w:cs="Times New Roman"/>
+          <w:b/>
+          <w:bCs/>
+          <w:sz w:val="24"/>
+          <w:szCs w:val="24"/>
+        </w:rPr>
+        <w:t xml:space="preserve">Task 5: </w:t>
+      </w:r>
+      <w:r>
+        <w:rPr>
+          <w:rFonts w:ascii="Times New Roman" w:hAnsi="Times New Roman" w:cs="Times New Roman"/>
+          <w:b/>
+          <w:bCs/>
+          <w:sz w:val="24"/>
+          <w:szCs w:val="24"/>
+        </w:rPr>
+        <w:t>Cybercrime Awareness Case Study &amp; Prevention Guide:</w:t>
+      </w:r>
+    </w:p>
+    <w:p>
+      <w:pPr>
+        <w:spacing w:after="0"/>
+        <w:rPr>
+          <w:rFonts w:ascii="Times New Roman" w:hAnsi="Times New Roman" w:cs="Times New Roman"/>
+          <w:sz w:val="24"/>
+          <w:szCs w:val="24"/>
+        </w:rPr>
+      </w:pPr>
+      <w:r>
+        <w:rPr>
+          <w:rFonts w:ascii="Times New Roman" w:hAnsi="Times New Roman" w:cs="Times New Roman"/>
+          <w:b/>
+          <w:bCs/>
+          <w:sz w:val="24"/>
+          <w:szCs w:val="24"/>
+        </w:rPr>
+        <w:t xml:space="preserve">           </w:t>
+      </w:r>
+      <w:r>
+        <w:rPr>
+          <w:rFonts w:ascii="Times New Roman" w:hAnsi="Times New Roman" w:cs="Times New Roman"/>
+          <w:sz w:val="24"/>
+          <w:szCs w:val="24"/>
+        </w:rPr>
+        <w:t xml:space="preserve">        In taken up case</w:t>
+      </w:r>
+      <w:r>
+        <w:rPr>
+          <w:rFonts w:ascii="Times New Roman" w:hAnsi="Times New Roman" w:cs="Times New Roman"/>
         </w:rPr>
         <w:t xml:space="preserve"> </w:t>
       </w:r>
-    </w:p>
-    <w:p>
-      <w:pPr>
-        <w:spacing w:before="100" w:beforeAutospacing="1" w:after="100" w:afterAutospacing="1" w:line="240" w:lineRule="auto"/>
+      <w:r>
+        <w:rPr>
+          <w:rFonts w:ascii="Times New Roman" w:hAnsi="Times New Roman" w:cs="Times New Roman"/>
+          <w:sz w:val="24"/>
+          <w:szCs w:val="24"/>
+        </w:rPr>
+        <w:t xml:space="preserve">all the fraudulent transactions were conducted via UPI without the victims entering their PINs or receiving and SMS notifications. </w:t>
+      </w:r>
+      <w:r>
+        <w:rPr>
+          <w:rFonts w:ascii="Times New Roman" w:hAnsi="Times New Roman" w:cs="Times New Roman"/>
+          <w:sz w:val="24"/>
+          <w:szCs w:val="24"/>
+        </w:rPr>
+        <w:t xml:space="preserve">This case of fraudulent </w:t>
+      </w:r>
+      <w:r>
+        <w:rPr>
+          <w:rFonts w:ascii="Times New Roman" w:hAnsi="Times New Roman" w:cs="Times New Roman"/>
+          <w:sz w:val="24"/>
+          <w:szCs w:val="24"/>
+        </w:rPr>
+        <w:lastRenderedPageBreak/>
+        <w:t>UPI transactions was highly surprising because significant amounts were withdrawn without the victims entering their PINs or receiving any SMS notifications. It highlights how cybercriminals can exploit system vulnerabilities or user negligence to bypass basic security measures. The fact that such large financial losses occurred without immediate alerts raises concerns about digital transaction safety and awareness.</w:t>
+      </w:r>
+    </w:p>
+    <w:p>
+      <w:pPr>
+        <w:spacing w:after="0"/>
+        <w:rPr>
+          <w:rFonts w:ascii="Times New Roman" w:hAnsi="Times New Roman" w:cs="Times New Roman"/>
+          <w:sz w:val="24"/>
+          <w:szCs w:val="24"/>
+        </w:rPr>
+      </w:pPr>
+      <w:r>
+        <w:rPr>
+          <w:rFonts w:ascii="Times New Roman" w:hAnsi="Times New Roman" w:cs="Times New Roman"/>
+          <w:sz w:val="24"/>
+          <w:szCs w:val="24"/>
+        </w:rPr>
+        <w:t xml:space="preserve">                </w:t>
+      </w:r>
+      <w:r>
+        <w:rPr>
+          <w:rFonts w:ascii="Times New Roman" w:hAnsi="Times New Roman" w:cs="Times New Roman"/>
+          <w:sz w:val="24"/>
+          <w:szCs w:val="24"/>
+        </w:rPr>
+        <w:t>One important habit I will change is being more cautious while using digital payment platforms. I will ensure that I never click on unknown links, share sensitive information, or install untrusted applications. I will also regularly monitor my bank transactions and enable all possible security features such as alerts and authentication layers. This incident has made me more aware of the importance of digital security and responsible online practices.</w:t>
+      </w:r>
+    </w:p>
+    <w:p>
+      <w:pPr>
+        <w:spacing w:after="0"/>
+        <w:jc w:val="both"/>
+        <w:rPr>
+          <w:rFonts w:ascii="Times New Roman" w:hAnsi="Times New Roman" w:cs="Times New Roman"/>
+          <w:sz w:val="24"/>
+          <w:szCs w:val="24"/>
+        </w:rPr>
+      </w:pPr>
+    </w:p>
+    <w:p>
+      <w:pPr>
+        <w:spacing w:after="0"/>
+        <w:rPr>
+          <w:rFonts w:ascii="Times New Roman" w:hAnsi="Times New Roman" w:cs="Times New Roman"/>
+          <w:sz w:val="24"/>
+          <w:szCs w:val="24"/>
+        </w:rPr>
+      </w:pPr>
+      <w:r>
+        <w:rPr>
+          <w:rFonts w:ascii="Times New Roman" w:hAnsi="Times New Roman" w:cs="Times New Roman"/>
+          <w:sz w:val="24"/>
+          <w:szCs w:val="24"/>
+        </w:rPr>
+        <w:br/>
+      </w:r>
+      <w:r>
+        <w:rPr>
+          <w:rFonts w:ascii="Times New Roman" w:hAnsi="Times New Roman" w:cs="Times New Roman"/>
+          <w:b/>
+          <w:bCs/>
+          <w:sz w:val="24"/>
+          <w:szCs w:val="24"/>
+        </w:rPr>
+        <w:t>Conclusion</w:t>
+      </w:r>
+      <w:r>
+        <w:rPr>
+          <w:rFonts w:ascii="Times New Roman" w:hAnsi="Times New Roman" w:cs="Times New Roman"/>
+          <w:sz w:val="24"/>
+          <w:szCs w:val="24"/>
+        </w:rPr>
+        <w:t xml:space="preserve">- It was not only a project but a practical awareness program about our present digital environment. How we can connect &amp; communicate to it and explore it, face and take part in its challenges and how to protect  ourself from it in case of adversity. </w:t>
+      </w:r>
+    </w:p>
+    <w:p>
+      <w:pPr>
+        <w:spacing w:after="0"/>
+        <w:rPr>
+          <w:rFonts w:ascii="Times New Roman" w:hAnsi="Times New Roman" w:cs="Times New Roman"/>
+          <w:sz w:val="24"/>
+          <w:szCs w:val="24"/>
+        </w:rPr>
+      </w:pPr>
+      <w:r>
+        <w:rPr>
+          <w:rFonts w:ascii="Times New Roman" w:hAnsi="Times New Roman" w:cs="Times New Roman"/>
+          <w:sz w:val="24"/>
+          <w:szCs w:val="24"/>
+        </w:rPr>
+        <w:t xml:space="preserve">             </w:t>
+      </w:r>
+      <w:r>
+        <w:rPr>
+          <w:rFonts w:ascii="Times New Roman" w:hAnsi="Times New Roman" w:cs="Times New Roman"/>
+          <w:sz w:val="24"/>
+          <w:szCs w:val="24"/>
+        </w:rPr>
+        <w:t>Through the tasks, I learned how to effectively use platforms like GitHub, LinkedIn, and HackerRank to build a strong digital and professional presence</w:t>
+      </w:r>
+      <w:r>
+        <w:rPr>
+          <w:rFonts w:ascii="Times New Roman" w:hAnsi="Times New Roman" w:cs="Times New Roman"/>
+          <w:sz w:val="24"/>
+          <w:szCs w:val="24"/>
+        </w:rPr>
+        <w:t>.</w:t>
+      </w:r>
+      <w:r>
         <w:rPr>
           <w:rFonts w:ascii="Times New Roman" w:eastAsia="Times New Roman" w:hAnsi="Times New Roman" w:cs="Times New Roman"/>
           <w:kern w:val="0"/>
@@ -957,103 +1270,6 @@
           <w:lang w:eastAsia="en-IN" w:bidi="sa-IN"/>
           <w14:ligatures w14:val="none"/>
         </w:rPr>
-      </w:pPr>
-      <w:r>
-        <w:rPr>
-          <w:rFonts w:ascii="Times New Roman" w:hAnsi="Times New Roman" w:cs="Times New Roman"/>
-          <w:sz w:val="24"/>
-          <w:szCs w:val="24"/>
-        </w:rPr>
-        <w:t>The purpose of this task was to enhance my formal communication skills and digital responsibility</w:t>
-      </w:r>
-    </w:p>
-    <w:p>
-      <w:pPr>
-        <w:spacing w:after="0"/>
-        <w:jc w:val="both"/>
-        <w:rPr>
-          <w:rFonts w:ascii="Times New Roman" w:hAnsi="Times New Roman" w:cs="Times New Roman"/>
-          <w:b/>
-          <w:bCs/>
-          <w:sz w:val="24"/>
-          <w:szCs w:val="24"/>
-        </w:rPr>
-      </w:pPr>
-    </w:p>
-    <w:p>
-      <w:pPr>
-        <w:spacing w:after="0"/>
-        <w:jc w:val="both"/>
-        <w:rPr>
-          <w:rFonts w:ascii="Times New Roman" w:hAnsi="Times New Roman" w:cs="Times New Roman"/>
-          <w:b/>
-          <w:bCs/>
-          <w:sz w:val="24"/>
-          <w:szCs w:val="24"/>
-        </w:rPr>
-      </w:pPr>
-      <w:r>
-        <w:rPr>
-          <w:rFonts w:ascii="Times New Roman" w:hAnsi="Times New Roman" w:cs="Times New Roman"/>
-          <w:b/>
-          <w:bCs/>
-          <w:sz w:val="24"/>
-          <w:szCs w:val="24"/>
-        </w:rPr>
-        <w:t xml:space="preserve">Task 5: </w:t>
-      </w:r>
-      <w:r>
-        <w:rPr>
-          <w:rFonts w:ascii="Times New Roman" w:hAnsi="Times New Roman" w:cs="Times New Roman"/>
-          <w:b/>
-          <w:bCs/>
-          <w:sz w:val="24"/>
-          <w:szCs w:val="24"/>
-        </w:rPr>
-        <w:t>Cybercrime Awareness Case Study &amp; Prevention Guide</w:t>
-      </w:r>
-      <w:r>
-        <w:rPr>
-          <w:rFonts w:ascii="Times New Roman" w:hAnsi="Times New Roman" w:cs="Times New Roman"/>
-          <w:b/>
-          <w:bCs/>
-          <w:sz w:val="24"/>
-          <w:szCs w:val="24"/>
-        </w:rPr>
-        <w:t>:</w:t>
-      </w:r>
-    </w:p>
-    <w:p>
-      <w:pPr>
-        <w:spacing w:after="0"/>
-        <w:rPr>
-          <w:rFonts w:ascii="Times New Roman" w:hAnsi="Times New Roman" w:cs="Times New Roman"/>
-          <w:sz w:val="24"/>
-          <w:szCs w:val="24"/>
-        </w:rPr>
-      </w:pPr>
-      <w:r>
-        <w:rPr>
-          <w:rFonts w:ascii="Times New Roman" w:hAnsi="Times New Roman" w:cs="Times New Roman"/>
-          <w:b/>
-          <w:bCs/>
-          <w:sz w:val="24"/>
-          <w:szCs w:val="24"/>
-        </w:rPr>
-        <w:t xml:space="preserve">           </w:t>
-      </w:r>
-      <w:r>
-        <w:rPr>
-          <w:rFonts w:ascii="Times New Roman" w:hAnsi="Times New Roman" w:cs="Times New Roman"/>
-          <w:sz w:val="24"/>
-          <w:szCs w:val="24"/>
-        </w:rPr>
-        <w:t xml:space="preserve">        In taken up case</w:t>
-      </w:r>
-      <w:r>
-        <w:rPr>
-          <w:rFonts w:ascii="Times New Roman" w:hAnsi="Times New Roman" w:cs="Times New Roman"/>
-        </w:rPr>
         <w:t xml:space="preserve"> </w:t>
       </w:r>
       <w:r>
@@ -1062,155 +1278,7 @@
           <w:sz w:val="24"/>
           <w:szCs w:val="24"/>
         </w:rPr>
-        <w:t>all the fraudulent transactions were conducted via UPI without the victims entering their PINs or receiving and SMS notifications.</w:t>
-      </w:r>
-      <w:r>
-        <w:rPr>
-          <w:rFonts w:ascii="Times New Roman" w:hAnsi="Times New Roman" w:cs="Times New Roman"/>
-          <w:sz w:val="24"/>
-          <w:szCs w:val="24"/>
-        </w:rPr>
-        <w:t xml:space="preserve"> </w:t>
-      </w:r>
-      <w:r>
-        <w:rPr>
-          <w:rFonts w:ascii="Times New Roman" w:hAnsi="Times New Roman" w:cs="Times New Roman"/>
-          <w:sz w:val="24"/>
-          <w:szCs w:val="24"/>
-        </w:rPr>
-        <w:t xml:space="preserve">This case of fraudulent </w:t>
-      </w:r>
-      <w:r>
-        <w:rPr>
-          <w:rFonts w:ascii="Times New Roman" w:hAnsi="Times New Roman" w:cs="Times New Roman"/>
-          <w:sz w:val="24"/>
-          <w:szCs w:val="24"/>
-        </w:rPr>
-        <w:lastRenderedPageBreak/>
-        <w:t>UPI transactions was highly surprising because significant amounts were withdrawn without the victims entering their PINs or receiving any SMS notifications. It highlights how cybercriminals can exploit system vulnerabilities or user negligence to bypass basic security measures. The fact that such large financial losses occurred without immediate alerts raises concerns about digital transaction safety and awareness.</w:t>
-      </w:r>
-    </w:p>
-    <w:p>
-      <w:pPr>
-        <w:spacing w:after="0"/>
-        <w:rPr>
-          <w:rFonts w:ascii="Times New Roman" w:hAnsi="Times New Roman" w:cs="Times New Roman"/>
-          <w:sz w:val="24"/>
-          <w:szCs w:val="24"/>
-        </w:rPr>
-      </w:pPr>
-      <w:r>
-        <w:rPr>
-          <w:rFonts w:ascii="Times New Roman" w:hAnsi="Times New Roman" w:cs="Times New Roman"/>
-          <w:sz w:val="24"/>
-          <w:szCs w:val="24"/>
-        </w:rPr>
-        <w:t xml:space="preserve">                </w:t>
-      </w:r>
-      <w:r>
-        <w:rPr>
-          <w:rFonts w:ascii="Times New Roman" w:hAnsi="Times New Roman" w:cs="Times New Roman"/>
-          <w:sz w:val="24"/>
-          <w:szCs w:val="24"/>
-        </w:rPr>
-        <w:t>One important habit I will change is being more cautious while using digital payment platforms. I will ensure that I never click on unknown links, share sensitive information, or install untrusted applications. I will also regularly monitor my bank transactions and enable all possible security features such as alerts and authentication layers. This incident has made me more aware of the importance of digital security and responsible online practices.</w:t>
-      </w:r>
-    </w:p>
-    <w:p>
-      <w:pPr>
-        <w:spacing w:after="0"/>
-        <w:jc w:val="both"/>
-        <w:rPr>
-          <w:rFonts w:ascii="Times New Roman" w:hAnsi="Times New Roman" w:cs="Times New Roman"/>
-          <w:sz w:val="24"/>
-          <w:szCs w:val="24"/>
-        </w:rPr>
-      </w:pPr>
-    </w:p>
-    <w:p>
-      <w:pPr>
-        <w:spacing w:after="0"/>
-        <w:rPr>
-          <w:rFonts w:ascii="Times New Roman" w:hAnsi="Times New Roman" w:cs="Times New Roman"/>
-          <w:sz w:val="24"/>
-          <w:szCs w:val="24"/>
-        </w:rPr>
-      </w:pPr>
-      <w:r>
-        <w:rPr>
-          <w:rFonts w:ascii="Times New Roman" w:hAnsi="Times New Roman" w:cs="Times New Roman"/>
-          <w:sz w:val="24"/>
-          <w:szCs w:val="24"/>
-        </w:rPr>
-        <w:br/>
-      </w:r>
-      <w:r>
-        <w:rPr>
-          <w:rFonts w:ascii="Times New Roman" w:hAnsi="Times New Roman" w:cs="Times New Roman"/>
-          <w:b/>
-          <w:bCs/>
-          <w:sz w:val="24"/>
-          <w:szCs w:val="24"/>
-        </w:rPr>
-        <w:t>Conclusion</w:t>
-      </w:r>
-      <w:r>
-        <w:rPr>
-          <w:rFonts w:ascii="Times New Roman" w:hAnsi="Times New Roman" w:cs="Times New Roman"/>
-          <w:sz w:val="24"/>
-          <w:szCs w:val="24"/>
-        </w:rPr>
-        <w:t xml:space="preserve">- It was not only a project but a practical awareness program about our present digital environment. How we can connect &amp; </w:t>
-      </w:r>
-      <w:r>
-        <w:rPr>
-          <w:rFonts w:ascii="Times New Roman" w:hAnsi="Times New Roman" w:cs="Times New Roman"/>
-          <w:sz w:val="24"/>
-          <w:szCs w:val="24"/>
-        </w:rPr>
-        <w:t>communicate</w:t>
-      </w:r>
-      <w:r>
-        <w:rPr>
-          <w:rFonts w:ascii="Times New Roman" w:hAnsi="Times New Roman" w:cs="Times New Roman"/>
-          <w:sz w:val="24"/>
-          <w:szCs w:val="24"/>
-        </w:rPr>
-        <w:t xml:space="preserve"> to it and explore it, face and take part in its challenges and how to protect  ourself from it in case of adversity. </w:t>
-      </w:r>
-    </w:p>
-    <w:p>
-      <w:pPr>
-        <w:spacing w:after="0"/>
-        <w:rPr>
-          <w:rFonts w:ascii="Times New Roman" w:hAnsi="Times New Roman" w:cs="Times New Roman"/>
-          <w:sz w:val="24"/>
-          <w:szCs w:val="24"/>
-        </w:rPr>
-      </w:pPr>
-      <w:r>
-        <w:rPr>
-          <w:rFonts w:ascii="Times New Roman" w:hAnsi="Times New Roman" w:cs="Times New Roman"/>
-          <w:sz w:val="24"/>
-          <w:szCs w:val="24"/>
-        </w:rPr>
-        <w:t xml:space="preserve">             </w:t>
-      </w:r>
-      <w:r>
-        <w:rPr>
-          <w:rFonts w:ascii="Times New Roman" w:hAnsi="Times New Roman" w:cs="Times New Roman"/>
-          <w:sz w:val="24"/>
-          <w:szCs w:val="24"/>
-        </w:rPr>
-        <w:t>Through the tasks, I learned how to effectively use platforms like GitHub, LinkedIn, and HackerRank to build a strong digital and professional presence</w:t>
-      </w:r>
-      <w:r>
-        <w:rPr>
-          <w:rFonts w:ascii="Times New Roman" w:hAnsi="Times New Roman" w:cs="Times New Roman"/>
-          <w:sz w:val="24"/>
-          <w:szCs w:val="24"/>
-        </w:rPr>
-        <w:t>.</w:t>
+        <w:t>I also developed practical skills in creating content using design tools, solving coding problems, and collaborating using online platforms.</w:t>
       </w:r>
       <w:r>
         <w:rPr>
@@ -1229,79 +1297,187 @@
           <w:sz w:val="24"/>
           <w:szCs w:val="24"/>
         </w:rPr>
-        <w:t>I also developed practical skills in creating content using design tools, solving coding problems, and collaborating using online platforms.</w:t>
-      </w:r>
-      <w:r>
-        <w:rPr>
-          <w:rFonts w:ascii="Times New Roman" w:eastAsia="Times New Roman" w:hAnsi="Times New Roman" w:cs="Times New Roman"/>
-          <w:kern w:val="0"/>
-          <w:sz w:val="24"/>
-          <w:szCs w:val="24"/>
-          <w:lang w:eastAsia="en-IN" w:bidi="sa-IN"/>
-          <w14:ligatures w14:val="none"/>
+        <w:t>It has prepared me to use digital platforms more responsibly and effectively, and it will be beneficial for my academic growth as well as future career opportunities.</w:t>
+      </w:r>
+    </w:p>
+    <w:p>
+      <w:pPr>
+        <w:spacing w:after="0"/>
+        <w:rPr>
+          <w:rFonts w:ascii="Times New Roman" w:hAnsi="Times New Roman" w:cs="Times New Roman"/>
+          <w:sz w:val="24"/>
+          <w:szCs w:val="24"/>
+        </w:rPr>
+      </w:pPr>
+      <w:r>
+        <w:rPr>
+          <w:rFonts w:ascii="Times New Roman" w:hAnsi="Times New Roman" w:cs="Times New Roman"/>
+          <w:sz w:val="24"/>
+          <w:szCs w:val="24"/>
+        </w:rPr>
+        <w:t xml:space="preserve">             Overall, this project improved my technical, communication, and analytical skills.</w:t>
+      </w:r>
+    </w:p>
+    <w:p>
+      <w:pPr>
+        <w:spacing w:after="0"/>
+        <w:rPr>
+          <w:rFonts w:ascii="Times New Roman" w:hAnsi="Times New Roman" w:cs="Times New Roman"/>
+          <w:sz w:val="24"/>
+          <w:szCs w:val="24"/>
+        </w:rPr>
+      </w:pPr>
+      <w:r>
+        <w:rPr>
+          <w:rFonts w:ascii="Times New Roman" w:hAnsi="Times New Roman" w:cs="Times New Roman"/>
+          <w:sz w:val="24"/>
+          <w:szCs w:val="24"/>
+        </w:rPr>
+        <w:br/>
+      </w:r>
+      <w:r>
+        <w:rPr>
+          <w:rFonts w:ascii="Times New Roman" w:hAnsi="Times New Roman" w:cs="Times New Roman"/>
+          <w:sz w:val="24"/>
+          <w:szCs w:val="24"/>
+        </w:rPr>
+        <w:br/>
+      </w:r>
+    </w:p>
+    <w:p>
+      <w:pPr>
+        <w:spacing w:after="0"/>
+        <w:jc w:val="both"/>
+        <w:rPr>
+          <w:rFonts w:ascii="Times New Roman" w:hAnsi="Times New Roman" w:cs="Times New Roman"/>
+          <w:sz w:val="24"/>
+          <w:szCs w:val="24"/>
+        </w:rPr>
+      </w:pPr>
+    </w:p>
+    <w:p>
+      <w:pPr>
+        <w:spacing w:after="0"/>
+        <w:jc w:val="both"/>
+        <w:rPr>
+          <w:rFonts w:ascii="Times New Roman" w:hAnsi="Times New Roman" w:cs="Times New Roman"/>
+          <w:b/>
+          <w:bCs/>
+          <w:sz w:val="24"/>
+          <w:szCs w:val="24"/>
+        </w:rPr>
+      </w:pPr>
+      <w:r>
+        <w:rPr>
+          <w:rFonts w:ascii="Times New Roman" w:hAnsi="Times New Roman" w:cs="Times New Roman"/>
+          <w:sz w:val="24"/>
+          <w:szCs w:val="24"/>
+        </w:rPr>
+        <w:t>R</w:t>
+      </w:r>
+      <w:r>
+        <w:rPr>
+          <w:rFonts w:ascii="Times New Roman" w:hAnsi="Times New Roman" w:cs="Times New Roman"/>
+          <w:b/>
+          <w:bCs/>
+          <w:sz w:val="24"/>
+          <w:szCs w:val="24"/>
+        </w:rPr>
+        <w:t>eference</w:t>
+      </w:r>
+    </w:p>
+    <w:p>
+      <w:pPr>
+        <w:spacing w:after="0"/>
+        <w:jc w:val="both"/>
+        <w:rPr>
+          <w:rFonts w:ascii="Times New Roman" w:hAnsi="Times New Roman" w:cs="Times New Roman"/>
+          <w:b/>
+          <w:bCs/>
+          <w:sz w:val="24"/>
+          <w:szCs w:val="24"/>
+        </w:rPr>
+      </w:pPr>
+    </w:p>
+    <w:p>
+      <w:pPr>
+        <w:spacing w:after="0"/>
+        <w:jc w:val="both"/>
+        <w:rPr>
+          <w:rFonts w:ascii="Times New Roman" w:hAnsi="Times New Roman" w:cs="Times New Roman"/>
+          <w:sz w:val="24"/>
+          <w:szCs w:val="24"/>
+        </w:rPr>
+      </w:pPr>
+      <w:r>
+        <w:rPr>
+          <w:rFonts w:ascii="Times New Roman" w:hAnsi="Times New Roman" w:cs="Times New Roman"/>
+          <w:b/>
+          <w:bCs/>
+          <w:sz w:val="24"/>
+          <w:szCs w:val="24"/>
+        </w:rPr>
+        <w:t>Task 1-</w:t>
+      </w:r>
+      <w:r>
+        <w:rPr>
+          <w:rFonts w:ascii="Times New Roman" w:hAnsi="Times New Roman" w:cs="Times New Roman"/>
+          <w:b/>
+          <w:bCs/>
+          <w:sz w:val="24"/>
+          <w:szCs w:val="24"/>
+        </w:rPr>
+        <w:t xml:space="preserve">   </w:t>
+      </w:r>
+      <w:r>
+        <w:rPr>
+          <w:rFonts w:ascii="Times New Roman" w:hAnsi="Times New Roman" w:cs="Times New Roman"/>
+          <w:sz w:val="24"/>
+          <w:szCs w:val="24"/>
+        </w:rPr>
+        <w:t>canva.com</w:t>
+      </w:r>
+    </w:p>
+    <w:p>
+      <w:pPr>
+        <w:spacing w:after="0"/>
+        <w:jc w:val="both"/>
+        <w:rPr>
+          <w:rFonts w:ascii="Times New Roman" w:hAnsi="Times New Roman" w:cs="Times New Roman"/>
+          <w:b/>
+          <w:bCs/>
+          <w:sz w:val="24"/>
+          <w:szCs w:val="24"/>
+        </w:rPr>
+      </w:pPr>
+      <w:r>
+        <w:rPr>
+          <w:rFonts w:ascii="Times New Roman" w:hAnsi="Times New Roman" w:cs="Times New Roman"/>
+          <w:b/>
+          <w:bCs/>
+          <w:sz w:val="24"/>
+          <w:szCs w:val="24"/>
+        </w:rPr>
+        <w:t xml:space="preserve">Task2-    </w:t>
+      </w:r>
+      <w:r>
+        <w:rPr>
+          <w:rFonts w:ascii="Times New Roman" w:hAnsi="Times New Roman" w:cs="Times New Roman"/>
+          <w:sz w:val="24"/>
+          <w:szCs w:val="24"/>
+        </w:rPr>
+        <w:t>Linkedin.com , Kaggel.com</w:t>
+      </w:r>
+      <w:r>
+        <w:rPr>
+          <w:rFonts w:ascii="Times New Roman" w:hAnsi="Times New Roman" w:cs="Times New Roman"/>
+          <w:b/>
+          <w:bCs/>
+          <w:sz w:val="24"/>
+          <w:szCs w:val="24"/>
         </w:rPr>
         <w:t xml:space="preserve"> </w:t>
       </w:r>
-      <w:r>
-        <w:rPr>
-          <w:rFonts w:ascii="Times New Roman" w:hAnsi="Times New Roman" w:cs="Times New Roman"/>
-          <w:sz w:val="24"/>
-          <w:szCs w:val="24"/>
-        </w:rPr>
-        <w:t>It has prepared me to use digital platforms more responsibly and effectively, and it will be beneficial for my academic growth as well as future career opportunities.</w:t>
-      </w:r>
-    </w:p>
-    <w:p>
-      <w:pPr>
-        <w:spacing w:after="0"/>
-        <w:rPr>
-          <w:rFonts w:ascii="Times New Roman" w:hAnsi="Times New Roman" w:cs="Times New Roman"/>
-          <w:sz w:val="24"/>
-          <w:szCs w:val="24"/>
-        </w:rPr>
-      </w:pPr>
-      <w:r>
-        <w:rPr>
-          <w:rFonts w:ascii="Times New Roman" w:hAnsi="Times New Roman" w:cs="Times New Roman"/>
-          <w:sz w:val="24"/>
-          <w:szCs w:val="24"/>
-        </w:rPr>
-        <w:t xml:space="preserve">             </w:t>
-      </w:r>
-      <w:r>
-        <w:rPr>
-          <w:rFonts w:ascii="Times New Roman" w:hAnsi="Times New Roman" w:cs="Times New Roman"/>
-          <w:sz w:val="24"/>
-          <w:szCs w:val="24"/>
-        </w:rPr>
-        <w:t>Overall, this project improved my technical, communication, and analytical skills.</w:t>
-      </w:r>
-    </w:p>
-    <w:p>
-      <w:pPr>
-        <w:spacing w:after="0"/>
-        <w:rPr>
-          <w:rFonts w:ascii="Times New Roman" w:hAnsi="Times New Roman" w:cs="Times New Roman"/>
-          <w:sz w:val="24"/>
-          <w:szCs w:val="24"/>
-        </w:rPr>
-      </w:pPr>
-      <w:r>
-        <w:rPr>
-          <w:rFonts w:ascii="Times New Roman" w:hAnsi="Times New Roman" w:cs="Times New Roman"/>
-          <w:sz w:val="24"/>
-          <w:szCs w:val="24"/>
-        </w:rPr>
-        <w:br/>
-      </w:r>
-      <w:r>
-        <w:rPr>
-          <w:rFonts w:ascii="Times New Roman" w:hAnsi="Times New Roman" w:cs="Times New Roman"/>
-          <w:sz w:val="24"/>
-          <w:szCs w:val="24"/>
-        </w:rPr>
-        <w:br/>
-      </w:r>
     </w:p>
     <w:p>
       <w:pPr>
@@ -1313,6 +1489,24 @@
           <w:szCs w:val="24"/>
         </w:rPr>
       </w:pPr>
+      <w:r>
+        <w:rPr>
+          <w:rFonts w:ascii="Times New Roman" w:hAnsi="Times New Roman" w:cs="Times New Roman"/>
+          <w:b/>
+          <w:bCs/>
+          <w:sz w:val="24"/>
+          <w:szCs w:val="24"/>
+        </w:rPr>
+        <w:t xml:space="preserve">Task3-    </w:t>
+      </w:r>
+      <w:r>
+        <w:rPr>
+          <w:rFonts w:ascii="Times New Roman" w:hAnsi="Times New Roman" w:cs="Times New Roman"/>
+          <w:sz w:val="24"/>
+          <w:szCs w:val="24"/>
+        </w:rPr>
+        <w:t>Hackerrank.com</w:t>
+      </w:r>
     </w:p>
     <w:p>
       <w:pPr>
@@ -1329,20 +1523,20 @@
       <w:r>
         <w:rPr>
           <w:rFonts w:ascii="Times New Roman" w:hAnsi="Times New Roman" w:cs="Times New Roman"/>
-          <w:sz w:val="24"/>
-          <w:szCs w:val="24"/>
-        </w:rPr>
-        <w:t>R</w:t>
-      </w:r>
-      <w:r>
-        <w:rPr>
-          <w:rFonts w:ascii="Times New Roman" w:hAnsi="Times New Roman" w:cs="Times New Roman"/>
-          <w:b/>
-          <w:bCs/>
-          <w:sz w:val="24"/>
-          <w:szCs w:val="24"/>
-        </w:rPr>
-        <w:t>eference</w:t>
+          <w:b/>
+          <w:bCs/>
+          <w:sz w:val="24"/>
+          <w:szCs w:val="24"/>
+        </w:rPr>
+        <w:t xml:space="preserve">Task5-    </w:t>
+      </w:r>
+      <w:r>
+        <w:rPr>
+          <w:rFonts w:ascii="Times New Roman" w:hAnsi="Times New Roman" w:cs="Times New Roman"/>
+          <w:sz w:val="24"/>
+          <w:szCs w:val="24"/>
+        </w:rPr>
+        <w:t>cybercrime.gov.in</w:t>
       </w:r>
     </w:p>
     <w:p>
@@ -1351,8 +1545,6 @@
         <w:jc w:val="both"/>
         <w:rPr>
           <w:rFonts w:ascii="Times New Roman" w:hAnsi="Times New Roman" w:cs="Times New Roman"/>
-          <w:b/>
-          <w:bCs/>
           <w:sz w:val="24"/>
           <w:szCs w:val="24"/>
         </w:rPr>
@@ -1368,34 +1560,6 @@
           <w:szCs w:val="24"/>
         </w:rPr>
       </w:pPr>
-      <w:r>
-        <w:rPr>
-          <w:rFonts w:ascii="Times New Roman" w:hAnsi="Times New Roman" w:cs="Times New Roman"/>
-          <w:b/>
-          <w:bCs/>
-          <w:sz w:val="24"/>
-          <w:szCs w:val="24"/>
-        </w:rPr>
-        <w:t>Task 1-</w:t>
-      </w:r>
-      <w:r>
-        <w:rPr>
-          <w:rFonts w:ascii="Times New Roman" w:hAnsi="Times New Roman" w:cs="Times New Roman"/>
-          <w:b/>
-          <w:bCs/>
-          <w:sz w:val="24"/>
-          <w:szCs w:val="24"/>
-        </w:rPr>
-        <w:t xml:space="preserve">   </w:t>
-      </w:r>
-      <w:r>
-        <w:rPr>
-          <w:rFonts w:ascii="Times New Roman" w:hAnsi="Times New Roman" w:cs="Times New Roman"/>
-          <w:sz w:val="24"/>
-          <w:szCs w:val="24"/>
-        </w:rPr>
-        <w:t>canva.com</w:t>
-      </w:r>
     </w:p>
     <w:p>
       <w:pPr>
@@ -1403,35 +1567,89 @@
         <w:jc w:val="both"/>
         <w:rPr>
           <w:rFonts w:ascii="Times New Roman" w:hAnsi="Times New Roman" w:cs="Times New Roman"/>
-          <w:b/>
-          <w:bCs/>
-          <w:sz w:val="24"/>
-          <w:szCs w:val="24"/>
-        </w:rPr>
-      </w:pPr>
-      <w:r>
-        <w:rPr>
-          <w:rFonts w:ascii="Times New Roman" w:hAnsi="Times New Roman" w:cs="Times New Roman"/>
-          <w:b/>
-          <w:bCs/>
-          <w:sz w:val="24"/>
-          <w:szCs w:val="24"/>
-        </w:rPr>
-        <w:t xml:space="preserve">Task2-    </w:t>
-      </w:r>
-      <w:r>
-        <w:rPr>
-          <w:rFonts w:ascii="Times New Roman" w:hAnsi="Times New Roman" w:cs="Times New Roman"/>
-          <w:sz w:val="24"/>
-          <w:szCs w:val="24"/>
-        </w:rPr>
-        <w:t>Linkedin.com , Kaggel.com</w:t>
-      </w:r>
-      <w:r>
-        <w:rPr>
-          <w:rFonts w:ascii="Times New Roman" w:hAnsi="Times New Roman" w:cs="Times New Roman"/>
-          <w:b/>
-          <w:bCs/>
+          <w:sz w:val="24"/>
+          <w:szCs w:val="24"/>
+        </w:rPr>
+      </w:pPr>
+    </w:p>
+    <w:p>
+      <w:pPr>
+        <w:spacing w:after="0"/>
+        <w:jc w:val="both"/>
+        <w:rPr>
+          <w:rFonts w:ascii="Times New Roman" w:hAnsi="Times New Roman" w:cs="Times New Roman"/>
+          <w:b/>
+          <w:bCs/>
+          <w:sz w:val="24"/>
+          <w:szCs w:val="24"/>
+        </w:rPr>
+      </w:pPr>
+    </w:p>
+    <w:p>
+      <w:pPr>
+        <w:spacing w:after="0"/>
+        <w:jc w:val="both"/>
+        <w:rPr>
+          <w:rFonts w:ascii="Times New Roman" w:hAnsi="Times New Roman" w:cs="Times New Roman"/>
+          <w:b/>
+          <w:bCs/>
+          <w:sz w:val="24"/>
+          <w:szCs w:val="24"/>
+        </w:rPr>
+      </w:pPr>
+    </w:p>
+    <w:p>
+      <w:pPr>
+        <w:spacing w:after="0"/>
+        <w:jc w:val="both"/>
+        <w:rPr>
+          <w:rFonts w:ascii="Times New Roman" w:hAnsi="Times New Roman" w:cs="Times New Roman"/>
+          <w:b/>
+          <w:bCs/>
+          <w:sz w:val="24"/>
+          <w:szCs w:val="24"/>
+        </w:rPr>
+      </w:pPr>
+    </w:p>
+    <w:p>
+      <w:pPr>
+        <w:spacing w:after="0"/>
+        <w:jc w:val="both"/>
+        <w:rPr>
+          <w:rFonts w:ascii="Times New Roman" w:hAnsi="Times New Roman" w:cs="Times New Roman"/>
+          <w:b/>
+          <w:bCs/>
+          <w:sz w:val="24"/>
+          <w:szCs w:val="24"/>
+        </w:rPr>
+      </w:pPr>
+    </w:p>
+    <w:p>
+      <w:pPr>
+        <w:spacing w:after="0"/>
+        <w:jc w:val="both"/>
+        <w:rPr>
+          <w:rFonts w:ascii="Times New Roman" w:hAnsi="Times New Roman" w:cs="Times New Roman"/>
+          <w:b/>
+          <w:bCs/>
+          <w:sz w:val="24"/>
+          <w:szCs w:val="24"/>
+        </w:rPr>
+      </w:pPr>
+    </w:p>
+    <w:p>
+      <w:pPr>
+        <w:spacing w:after="0"/>
+        <w:jc w:val="both"/>
+        <w:rPr>
+          <w:rFonts w:ascii="Times New Roman" w:hAnsi="Times New Roman" w:cs="Times New Roman"/>
+          <w:sz w:val="24"/>
+          <w:szCs w:val="24"/>
+        </w:rPr>
+      </w:pPr>
+      <w:r>
+        <w:rPr>
+          <w:rFonts w:ascii="Times New Roman" w:hAnsi="Times New Roman" w:cs="Times New Roman"/>
           <w:sz w:val="24"/>
           <w:szCs w:val="24"/>
         </w:rPr>
@@ -1441,165 +1659,156 @@
     <w:p>
       <w:pPr>
         <w:spacing w:after="0"/>
-        <w:jc w:val="both"/>
-        <w:rPr>
-          <w:rFonts w:ascii="Times New Roman" w:hAnsi="Times New Roman" w:cs="Times New Roman"/>
-          <w:sz w:val="24"/>
-          <w:szCs w:val="24"/>
-        </w:rPr>
-      </w:pPr>
-      <w:r>
-        <w:rPr>
-          <w:rFonts w:ascii="Times New Roman" w:hAnsi="Times New Roman" w:cs="Times New Roman"/>
-          <w:b/>
-          <w:bCs/>
-          <w:sz w:val="24"/>
-          <w:szCs w:val="24"/>
-        </w:rPr>
-        <w:t xml:space="preserve">Task3-    </w:t>
-      </w:r>
-      <w:r>
-        <w:rPr>
-          <w:rFonts w:ascii="Times New Roman" w:hAnsi="Times New Roman" w:cs="Times New Roman"/>
-          <w:sz w:val="24"/>
-          <w:szCs w:val="24"/>
-        </w:rPr>
-        <w:t>Hackerrank.com</w:t>
-      </w:r>
-    </w:p>
-    <w:p>
-      <w:pPr>
-        <w:spacing w:after="0"/>
-        <w:jc w:val="both"/>
-        <w:rPr>
-          <w:rFonts w:ascii="Times New Roman" w:hAnsi="Times New Roman" w:cs="Times New Roman"/>
-          <w:b/>
-          <w:bCs/>
-          <w:sz w:val="24"/>
-          <w:szCs w:val="24"/>
-        </w:rPr>
-      </w:pPr>
-      <w:r>
-        <w:rPr>
-          <w:rFonts w:ascii="Times New Roman" w:hAnsi="Times New Roman" w:cs="Times New Roman"/>
-          <w:b/>
-          <w:bCs/>
-          <w:sz w:val="24"/>
-          <w:szCs w:val="24"/>
-        </w:rPr>
-        <w:t xml:space="preserve">Task5-    </w:t>
-      </w:r>
-      <w:r>
-        <w:rPr>
-          <w:rFonts w:ascii="Times New Roman" w:hAnsi="Times New Roman" w:cs="Times New Roman"/>
-          <w:sz w:val="24"/>
-          <w:szCs w:val="24"/>
-        </w:rPr>
-        <w:t>cybercrime.gov.in</w:t>
-      </w:r>
-    </w:p>
-    <w:p>
-      <w:pPr>
-        <w:spacing w:after="0"/>
-        <w:jc w:val="both"/>
-        <w:rPr>
-          <w:rFonts w:ascii="Times New Roman" w:hAnsi="Times New Roman" w:cs="Times New Roman"/>
-          <w:sz w:val="24"/>
-          <w:szCs w:val="24"/>
-        </w:rPr>
-      </w:pPr>
-    </w:p>
-    <w:p>
-      <w:pPr>
-        <w:spacing w:after="0"/>
-        <w:jc w:val="both"/>
-        <w:rPr>
-          <w:rFonts w:ascii="Times New Roman" w:hAnsi="Times New Roman" w:cs="Times New Roman"/>
-          <w:sz w:val="24"/>
-          <w:szCs w:val="24"/>
-        </w:rPr>
-      </w:pPr>
-    </w:p>
-    <w:p>
-      <w:pPr>
-        <w:spacing w:after="0"/>
-        <w:jc w:val="both"/>
-        <w:rPr>
-          <w:rFonts w:ascii="Times New Roman" w:hAnsi="Times New Roman" w:cs="Times New Roman"/>
-          <w:sz w:val="24"/>
-          <w:szCs w:val="24"/>
-        </w:rPr>
-      </w:pPr>
-    </w:p>
-    <w:p>
-      <w:pPr>
-        <w:spacing w:after="0"/>
-        <w:jc w:val="both"/>
-        <w:rPr>
-          <w:rFonts w:ascii="Times New Roman" w:hAnsi="Times New Roman" w:cs="Times New Roman"/>
-          <w:b/>
-          <w:bCs/>
-          <w:sz w:val="24"/>
-          <w:szCs w:val="24"/>
-        </w:rPr>
-      </w:pPr>
-    </w:p>
-    <w:p>
-      <w:pPr>
-        <w:spacing w:after="0"/>
-        <w:jc w:val="both"/>
-        <w:rPr>
-          <w:rFonts w:ascii="Times New Roman" w:hAnsi="Times New Roman" w:cs="Times New Roman"/>
-          <w:b/>
-          <w:bCs/>
-          <w:sz w:val="24"/>
-          <w:szCs w:val="24"/>
-        </w:rPr>
-      </w:pPr>
-    </w:p>
-    <w:p>
-      <w:pPr>
-        <w:spacing w:after="0"/>
-        <w:jc w:val="both"/>
-        <w:rPr>
-          <w:rFonts w:ascii="Times New Roman" w:hAnsi="Times New Roman" w:cs="Times New Roman"/>
-          <w:b/>
-          <w:bCs/>
-          <w:sz w:val="24"/>
-          <w:szCs w:val="24"/>
-        </w:rPr>
-      </w:pPr>
-    </w:p>
-    <w:p>
-      <w:pPr>
-        <w:spacing w:after="0"/>
-        <w:jc w:val="both"/>
-        <w:rPr>
-          <w:rFonts w:ascii="Times New Roman" w:hAnsi="Times New Roman" w:cs="Times New Roman"/>
-          <w:b/>
-          <w:bCs/>
-          <w:sz w:val="24"/>
-          <w:szCs w:val="24"/>
-        </w:rPr>
-      </w:pPr>
-    </w:p>
-    <w:p>
-      <w:pPr>
-        <w:spacing w:after="0"/>
-        <w:jc w:val="both"/>
-        <w:rPr>
-          <w:rFonts w:ascii="Times New Roman" w:hAnsi="Times New Roman" w:cs="Times New Roman"/>
-          <w:b/>
-          <w:bCs/>
-          <w:sz w:val="24"/>
-          <w:szCs w:val="24"/>
-        </w:rPr>
-      </w:pPr>
-    </w:p>
-    <w:p>
-      <w:pPr>
-        <w:spacing w:after="0"/>
-        <w:jc w:val="both"/>
+        <w:rPr>
+          <w:rFonts w:ascii="Times New Roman" w:hAnsi="Times New Roman" w:cs="Times New Roman"/>
+          <w:sz w:val="24"/>
+          <w:szCs w:val="24"/>
+        </w:rPr>
+      </w:pPr>
+    </w:p>
+    <w:p>
+      <w:pPr>
+        <w:spacing w:after="0"/>
+        <w:rPr>
+          <w:rFonts w:ascii="Times New Roman" w:hAnsi="Times New Roman" w:cs="Times New Roman"/>
+          <w:sz w:val="24"/>
+          <w:szCs w:val="24"/>
+        </w:rPr>
+      </w:pPr>
+    </w:p>
+    <w:p>
+      <w:pPr>
+        <w:spacing w:after="0"/>
+        <w:rPr>
+          <w:rFonts w:ascii="Times New Roman" w:hAnsi="Times New Roman" w:cs="Times New Roman"/>
+          <w:sz w:val="24"/>
+          <w:szCs w:val="24"/>
+        </w:rPr>
+      </w:pPr>
+    </w:p>
+    <w:p>
+      <w:pPr>
+        <w:spacing w:after="0"/>
+        <w:rPr>
+          <w:rFonts w:ascii="Times New Roman" w:hAnsi="Times New Roman" w:cs="Times New Roman"/>
+          <w:sz w:val="24"/>
+          <w:szCs w:val="24"/>
+        </w:rPr>
+      </w:pPr>
+    </w:p>
+    <w:p>
+      <w:pPr>
+        <w:spacing w:after="0"/>
+        <w:rPr>
+          <w:rFonts w:ascii="Times New Roman" w:hAnsi="Times New Roman" w:cs="Times New Roman"/>
+          <w:sz w:val="24"/>
+          <w:szCs w:val="24"/>
+        </w:rPr>
+      </w:pPr>
+    </w:p>
+    <w:p>
+      <w:pPr>
+        <w:spacing w:after="0"/>
+        <w:rPr>
+          <w:rFonts w:ascii="Times New Roman" w:hAnsi="Times New Roman" w:cs="Times New Roman"/>
+          <w:sz w:val="24"/>
+          <w:szCs w:val="24"/>
+        </w:rPr>
+      </w:pPr>
+    </w:p>
+    <w:p>
+      <w:pPr>
+        <w:spacing w:after="0"/>
+        <w:rPr>
+          <w:rFonts w:ascii="Times New Roman" w:hAnsi="Times New Roman" w:cs="Times New Roman"/>
+          <w:sz w:val="24"/>
+          <w:szCs w:val="24"/>
+        </w:rPr>
+      </w:pPr>
+    </w:p>
+    <w:p>
+      <w:pPr>
+        <w:spacing w:after="0"/>
+        <w:rPr>
+          <w:rFonts w:ascii="Times New Roman" w:hAnsi="Times New Roman" w:cs="Times New Roman"/>
+          <w:sz w:val="24"/>
+          <w:szCs w:val="24"/>
+        </w:rPr>
+      </w:pPr>
+    </w:p>
+    <w:p>
+      <w:pPr>
+        <w:spacing w:after="0"/>
+        <w:rPr>
+          <w:rFonts w:ascii="Times New Roman" w:hAnsi="Times New Roman" w:cs="Times New Roman"/>
+          <w:sz w:val="24"/>
+          <w:szCs w:val="24"/>
+        </w:rPr>
+      </w:pPr>
+    </w:p>
+    <w:p>
+      <w:pPr>
+        <w:spacing w:after="0"/>
+        <w:rPr>
+          <w:rFonts w:ascii="Times New Roman" w:hAnsi="Times New Roman" w:cs="Times New Roman"/>
+          <w:sz w:val="24"/>
+          <w:szCs w:val="24"/>
+        </w:rPr>
+      </w:pPr>
+    </w:p>
+    <w:p>
+      <w:pPr>
+        <w:spacing w:after="0"/>
+        <w:rPr>
+          <w:rFonts w:ascii="Times New Roman" w:hAnsi="Times New Roman" w:cs="Times New Roman"/>
+          <w:sz w:val="24"/>
+          <w:szCs w:val="24"/>
+        </w:rPr>
+      </w:pPr>
+    </w:p>
+    <w:p>
+      <w:pPr>
+        <w:spacing w:after="0"/>
+        <w:rPr>
+          <w:rFonts w:ascii="Times New Roman" w:hAnsi="Times New Roman" w:cs="Times New Roman"/>
+          <w:sz w:val="24"/>
+          <w:szCs w:val="24"/>
+        </w:rPr>
+      </w:pPr>
+    </w:p>
+    <w:p>
+      <w:pPr>
+        <w:spacing w:after="0"/>
+        <w:rPr>
+          <w:rFonts w:ascii="Times New Roman" w:hAnsi="Times New Roman" w:cs="Times New Roman"/>
+          <w:sz w:val="24"/>
+          <w:szCs w:val="24"/>
+        </w:rPr>
+      </w:pPr>
+    </w:p>
+    <w:p>
+      <w:pPr>
+        <w:spacing w:after="0"/>
+        <w:rPr>
+          <w:rFonts w:ascii="Times New Roman" w:hAnsi="Times New Roman" w:cs="Times New Roman"/>
+          <w:sz w:val="24"/>
+          <w:szCs w:val="24"/>
+        </w:rPr>
+      </w:pPr>
+    </w:p>
+    <w:p>
+      <w:pPr>
+        <w:spacing w:after="0"/>
+        <w:rPr>
+          <w:rFonts w:ascii="Times New Roman" w:hAnsi="Times New Roman" w:cs="Times New Roman"/>
+          <w:sz w:val="24"/>
+          <w:szCs w:val="24"/>
+        </w:rPr>
+      </w:pPr>
+    </w:p>
+    <w:p>
+      <w:pPr>
+        <w:spacing w:after="0"/>
         <w:rPr>
           <w:rFonts w:ascii="Times New Roman" w:hAnsi="Times New Roman" w:cs="Times New Roman"/>
           <w:sz w:val="24"/>
@@ -1614,166 +1823,6 @@
         </w:rPr>
         <w:t xml:space="preserve"> </w:t>
       </w:r>
-    </w:p>
-    <w:p>
-      <w:pPr>
-        <w:spacing w:after="0"/>
-        <w:rPr>
-          <w:rFonts w:ascii="Times New Roman" w:hAnsi="Times New Roman" w:cs="Times New Roman"/>
-          <w:sz w:val="24"/>
-          <w:szCs w:val="24"/>
-        </w:rPr>
-      </w:pPr>
-    </w:p>
-    <w:p>
-      <w:pPr>
-        <w:spacing w:after="0"/>
-        <w:rPr>
-          <w:rFonts w:ascii="Times New Roman" w:hAnsi="Times New Roman" w:cs="Times New Roman"/>
-          <w:sz w:val="24"/>
-          <w:szCs w:val="24"/>
-        </w:rPr>
-      </w:pPr>
-    </w:p>
-    <w:p>
-      <w:pPr>
-        <w:spacing w:after="0"/>
-        <w:rPr>
-          <w:rFonts w:ascii="Times New Roman" w:hAnsi="Times New Roman" w:cs="Times New Roman"/>
-          <w:sz w:val="24"/>
-          <w:szCs w:val="24"/>
-        </w:rPr>
-      </w:pPr>
-    </w:p>
-    <w:p>
-      <w:pPr>
-        <w:spacing w:after="0"/>
-        <w:rPr>
-          <w:rFonts w:ascii="Times New Roman" w:hAnsi="Times New Roman" w:cs="Times New Roman"/>
-          <w:sz w:val="24"/>
-          <w:szCs w:val="24"/>
-        </w:rPr>
-      </w:pPr>
-    </w:p>
-    <w:p>
-      <w:pPr>
-        <w:spacing w:after="0"/>
-        <w:rPr>
-          <w:rFonts w:ascii="Times New Roman" w:hAnsi="Times New Roman" w:cs="Times New Roman"/>
-          <w:sz w:val="24"/>
-          <w:szCs w:val="24"/>
-        </w:rPr>
-      </w:pPr>
-    </w:p>
-    <w:p>
-      <w:pPr>
-        <w:spacing w:after="0"/>
-        <w:rPr>
-          <w:rFonts w:ascii="Times New Roman" w:hAnsi="Times New Roman" w:cs="Times New Roman"/>
-          <w:sz w:val="24"/>
-          <w:szCs w:val="24"/>
-        </w:rPr>
-      </w:pPr>
-    </w:p>
-    <w:p>
-      <w:pPr>
-        <w:spacing w:after="0"/>
-        <w:rPr>
-          <w:rFonts w:ascii="Times New Roman" w:hAnsi="Times New Roman" w:cs="Times New Roman"/>
-          <w:sz w:val="24"/>
-          <w:szCs w:val="24"/>
-        </w:rPr>
-      </w:pPr>
-    </w:p>
-    <w:p>
-      <w:pPr>
-        <w:spacing w:after="0"/>
-        <w:rPr>
-          <w:rFonts w:ascii="Times New Roman" w:hAnsi="Times New Roman" w:cs="Times New Roman"/>
-          <w:sz w:val="24"/>
-          <w:szCs w:val="24"/>
-        </w:rPr>
-      </w:pPr>
-    </w:p>
-    <w:p>
-      <w:pPr>
-        <w:spacing w:after="0"/>
-        <w:rPr>
-          <w:rFonts w:ascii="Times New Roman" w:hAnsi="Times New Roman" w:cs="Times New Roman"/>
-          <w:sz w:val="24"/>
-          <w:szCs w:val="24"/>
-        </w:rPr>
-      </w:pPr>
-    </w:p>
-    <w:p>
-      <w:pPr>
-        <w:spacing w:after="0"/>
-        <w:rPr>
-          <w:rFonts w:ascii="Times New Roman" w:hAnsi="Times New Roman" w:cs="Times New Roman"/>
-          <w:sz w:val="24"/>
-          <w:szCs w:val="24"/>
-        </w:rPr>
-      </w:pPr>
-    </w:p>
-    <w:p>
-      <w:pPr>
-        <w:spacing w:after="0"/>
-        <w:rPr>
-          <w:rFonts w:ascii="Times New Roman" w:hAnsi="Times New Roman" w:cs="Times New Roman"/>
-          <w:sz w:val="24"/>
-          <w:szCs w:val="24"/>
-        </w:rPr>
-      </w:pPr>
-    </w:p>
-    <w:p>
-      <w:pPr>
-        <w:spacing w:after="0"/>
-        <w:rPr>
-          <w:rFonts w:ascii="Times New Roman" w:hAnsi="Times New Roman" w:cs="Times New Roman"/>
-          <w:sz w:val="24"/>
-          <w:szCs w:val="24"/>
-        </w:rPr>
-      </w:pPr>
-    </w:p>
-    <w:p>
-      <w:pPr>
-        <w:spacing w:after="0"/>
-        <w:rPr>
-          <w:rFonts w:ascii="Times New Roman" w:hAnsi="Times New Roman" w:cs="Times New Roman"/>
-          <w:sz w:val="24"/>
-          <w:szCs w:val="24"/>
-        </w:rPr>
-      </w:pPr>
-    </w:p>
-    <w:p>
-      <w:pPr>
-        <w:spacing w:after="0"/>
-        <w:rPr>
-          <w:rFonts w:ascii="Times New Roman" w:hAnsi="Times New Roman" w:cs="Times New Roman"/>
-          <w:sz w:val="24"/>
-          <w:szCs w:val="24"/>
-        </w:rPr>
-      </w:pPr>
-    </w:p>
-    <w:p>
-      <w:pPr>
-        <w:spacing w:after="0"/>
-        <w:rPr>
-          <w:rFonts w:ascii="Times New Roman" w:hAnsi="Times New Roman" w:cs="Times New Roman"/>
-          <w:sz w:val="24"/>
-          <w:szCs w:val="24"/>
-        </w:rPr>
-      </w:pPr>
-    </w:p>
-    <w:p>
-      <w:pPr>
-        <w:spacing w:after="0"/>
-        <w:rPr>
-          <w:rFonts w:ascii="Times New Roman" w:hAnsi="Times New Roman" w:cs="Times New Roman"/>
-          <w:sz w:val="24"/>
-          <w:szCs w:val="24"/>
-        </w:rPr>
-      </w:pPr>
       <w:r>
         <w:rPr>
           <w:rFonts w:ascii="Times New Roman" w:hAnsi="Times New Roman" w:cs="Times New Roman"/>
@@ -1785,6 +1834,96 @@
       <w:r>
         <w:rPr>
           <w:rFonts w:ascii="Times New Roman" w:hAnsi="Times New Roman" w:cs="Times New Roman"/>
+          <w:b/>
+          <w:bCs/>
+          <w:sz w:val="24"/>
+          <w:szCs w:val="24"/>
+        </w:rPr>
+        <w:t>Task 3 Write-up</w:t>
+      </w:r>
+      <w:r>
+        <w:rPr>
+          <w:rFonts w:ascii="Times New Roman" w:hAnsi="Times New Roman" w:cs="Times New Roman"/>
+          <w:sz w:val="24"/>
+          <w:szCs w:val="24"/>
+        </w:rPr>
+        <w:t xml:space="preserve"> Platforms used, what you built/practised 150–200 words </w:t>
+      </w:r>
+      <w:r>
+        <w:rPr>
+          <w:rFonts w:ascii="Times New Roman" w:hAnsi="Times New Roman" w:cs="Times New Roman"/>
+          <w:b/>
+          <w:bCs/>
+          <w:sz w:val="24"/>
+          <w:szCs w:val="24"/>
+        </w:rPr>
+        <w:t>Task 4 Write-up</w:t>
+      </w:r>
+      <w:r>
+        <w:rPr>
+          <w:rFonts w:ascii="Times New Roman" w:hAnsi="Times New Roman" w:cs="Times New Roman"/>
+          <w:sz w:val="24"/>
+          <w:szCs w:val="24"/>
+        </w:rPr>
+        <w:t xml:space="preserve"> Communication scenario, key learnings 100–150 words</w:t>
+      </w:r>
+    </w:p>
+    <w:p>
+      <w:pPr>
+        <w:tabs>
+          <w:tab w:val="left" w:pos="2436"/>
+        </w:tabs>
+        <w:spacing w:after="0"/>
+        <w:rPr>
+          <w:rFonts w:ascii="Times New Roman" w:hAnsi="Times New Roman" w:cs="Times New Roman"/>
+          <w:sz w:val="24"/>
+          <w:szCs w:val="24"/>
+        </w:rPr>
+      </w:pPr>
+      <w:r>
+        <w:rPr>
+          <w:rFonts w:ascii="Times New Roman" w:hAnsi="Times New Roman" w:cs="Times New Roman"/>
+          <w:b/>
+          <w:bCs/>
+          <w:sz w:val="24"/>
+          <w:szCs w:val="24"/>
+        </w:rPr>
+        <w:t>Task 5 Write-up</w:t>
+      </w:r>
+      <w:r>
+        <w:rPr>
+          <w:rFonts w:ascii="Times New Roman" w:hAnsi="Times New Roman" w:cs="Times New Roman"/>
+          <w:sz w:val="24"/>
+          <w:szCs w:val="24"/>
+        </w:rPr>
+        <w:t xml:space="preserve"> Content Required What surprised you, one habit you will change Approx. Length 100–150 words</w:t>
+      </w:r>
+    </w:p>
+    <w:p>
+      <w:pPr>
+        <w:tabs>
+          <w:tab w:val="left" w:pos="2436"/>
+        </w:tabs>
+        <w:spacing w:after="0"/>
+        <w:rPr>
+          <w:rFonts w:ascii="Times New Roman" w:hAnsi="Times New Roman" w:cs="Times New Roman"/>
+          <w:sz w:val="24"/>
+          <w:szCs w:val="24"/>
+        </w:rPr>
+      </w:pPr>
+      <w:r>
+        <w:rPr>
+          <w:rFonts w:ascii="Times New Roman" w:hAnsi="Times New Roman" w:cs="Times New Roman"/>
+          <w:b/>
+          <w:bCs/>
+          <w:sz w:val="24"/>
+          <w:szCs w:val="24"/>
+        </w:rPr>
+        <w:t>Conclusion</w:t>
+      </w:r>
+      <w:r>
+        <w:rPr>
+          <w:rFonts w:ascii="Times New Roman" w:hAnsi="Times New Roman" w:cs="Times New Roman"/>
           <w:sz w:val="24"/>
           <w:szCs w:val="24"/>
         </w:rPr>
@@ -1793,96 +1932,16 @@
       <w:r>
         <w:rPr>
           <w:rFonts w:ascii="Times New Roman" w:hAnsi="Times New Roman" w:cs="Times New Roman"/>
-          <w:b/>
-          <w:bCs/>
-          <w:sz w:val="24"/>
-          <w:szCs w:val="24"/>
-        </w:rPr>
-        <w:t>Task 3 Write-up</w:t>
-      </w:r>
-      <w:r>
-        <w:rPr>
-          <w:rFonts w:ascii="Times New Roman" w:hAnsi="Times New Roman" w:cs="Times New Roman"/>
-          <w:sz w:val="24"/>
-          <w:szCs w:val="24"/>
-        </w:rPr>
-        <w:t xml:space="preserve"> Platforms used, what you built/practised 150–200 words </w:t>
-      </w:r>
-      <w:r>
-        <w:rPr>
-          <w:rFonts w:ascii="Times New Roman" w:hAnsi="Times New Roman" w:cs="Times New Roman"/>
-          <w:b/>
-          <w:bCs/>
-          <w:sz w:val="24"/>
-          <w:szCs w:val="24"/>
-        </w:rPr>
-        <w:t>Task 4 Write-up</w:t>
-      </w:r>
-      <w:r>
-        <w:rPr>
-          <w:rFonts w:ascii="Times New Roman" w:hAnsi="Times New Roman" w:cs="Times New Roman"/>
-          <w:sz w:val="24"/>
-          <w:szCs w:val="24"/>
-        </w:rPr>
-        <w:t xml:space="preserve"> Communication scenario, key learnings 100–150 words</w:t>
-      </w:r>
-    </w:p>
-    <w:p>
-      <w:pPr>
-        <w:tabs>
-          <w:tab w:val="left" w:pos="2436"/>
-        </w:tabs>
-        <w:spacing w:after="0"/>
-        <w:rPr>
-          <w:rFonts w:ascii="Times New Roman" w:hAnsi="Times New Roman" w:cs="Times New Roman"/>
-          <w:sz w:val="24"/>
-          <w:szCs w:val="24"/>
-        </w:rPr>
-      </w:pPr>
-      <w:r>
-        <w:rPr>
-          <w:rFonts w:ascii="Times New Roman" w:hAnsi="Times New Roman" w:cs="Times New Roman"/>
-          <w:b/>
-          <w:bCs/>
-          <w:sz w:val="24"/>
-          <w:szCs w:val="24"/>
-        </w:rPr>
-        <w:t>Task 5 Write-up</w:t>
-      </w:r>
-      <w:r>
-        <w:rPr>
-          <w:rFonts w:ascii="Times New Roman" w:hAnsi="Times New Roman" w:cs="Times New Roman"/>
-          <w:sz w:val="24"/>
-          <w:szCs w:val="24"/>
-        </w:rPr>
-        <w:t xml:space="preserve"> Content Required What surprised you, one habit you will change Approx. Length 100–150 words</w:t>
-      </w:r>
-    </w:p>
-    <w:p>
-      <w:pPr>
-        <w:tabs>
-          <w:tab w:val="left" w:pos="2436"/>
-        </w:tabs>
-        <w:spacing w:after="0"/>
-        <w:rPr>
-          <w:rFonts w:ascii="Times New Roman" w:hAnsi="Times New Roman" w:cs="Times New Roman"/>
-          <w:sz w:val="24"/>
-          <w:szCs w:val="24"/>
-        </w:rPr>
-      </w:pPr>
-      <w:r>
-        <w:rPr>
-          <w:rFonts w:ascii="Times New Roman" w:hAnsi="Times New Roman" w:cs="Times New Roman"/>
-          <w:b/>
-          <w:bCs/>
-          <w:sz w:val="24"/>
-          <w:szCs w:val="24"/>
-        </w:rPr>
-        <w:t>Conclusion</w:t>
-      </w:r>
-      <w:r>
-        <w:rPr>
-          <w:rFonts w:ascii="Times New Roman" w:hAnsi="Times New Roman" w:cs="Times New Roman"/>
+          <w:sz w:val="24"/>
+          <w:szCs w:val="24"/>
+        </w:rPr>
+        <w:t>-</w:t>
+      </w:r>
+      <w:r>
+        <w:rPr>
+          <w:rFonts w:ascii="Times New Roman" w:hAnsi="Times New Roman" w:cs="Times New Roman"/>
+          <w:b/>
+          <w:bCs/>
           <w:sz w:val="24"/>
           <w:szCs w:val="24"/>
         </w:rPr>
@@ -1894,41 +1953,7 @@
           <w:sz w:val="24"/>
           <w:szCs w:val="24"/>
         </w:rPr>
-        <w:t>-</w:t>
-      </w:r>
-      <w:r>
-        <w:rPr>
-          <w:rFonts w:ascii="Times New Roman" w:hAnsi="Times New Roman" w:cs="Times New Roman"/>
-          <w:b/>
-          <w:bCs/>
-          <w:sz w:val="24"/>
-          <w:szCs w:val="24"/>
-        </w:rPr>
-        <w:t xml:space="preserve"> </w:t>
-      </w:r>
-      <w:r>
-        <w:rPr>
-          <w:rFonts w:ascii="Times New Roman" w:hAnsi="Times New Roman" w:cs="Times New Roman"/>
-          <w:sz w:val="24"/>
-          <w:szCs w:val="24"/>
-        </w:rPr>
-        <w:t>Overall learning from the project</w:t>
-      </w:r>
-      <w:r>
-        <w:rPr>
-          <w:rFonts w:ascii="Times New Roman" w:hAnsi="Times New Roman" w:cs="Times New Roman"/>
-          <w:sz w:val="24"/>
-          <w:szCs w:val="24"/>
-        </w:rPr>
-        <w:t xml:space="preserve"> </w:t>
-      </w:r>
-      <w:r>
-        <w:rPr>
-          <w:rFonts w:ascii="Times New Roman" w:hAnsi="Times New Roman" w:cs="Times New Roman"/>
-          <w:sz w:val="24"/>
-          <w:szCs w:val="24"/>
-        </w:rPr>
-        <w:t>100 words</w:t>
+        <w:t>Overall learning from the project 100 words</w:t>
       </w:r>
     </w:p>
     <w:p>
@@ -4879,6 +4904,7 @@
   <w:style w:type="character" w:default="1" w:styleId="DefaultParagraphFont">
     <w:name w:val="Default Paragraph Font"/>
     <w:uiPriority w:val="1"/>
+    <w:semiHidden/>
     <w:unhideWhenUsed/>
   </w:style>
   <w:style w:type="table" w:default="1" w:styleId="TableNormal">

</xml_diff>